<commit_message>
Handover doc: author's final adjustments
Version line, Appendix A.7 heading, and Appendix C wording (board name,
Bluetooth dongle note).

Co-Authored-By: Claude Opus 5.5 <noreply@anthropic.com>
Claude-Session: https://claude.ai/code/session_01T5w3MNfAvZmU4ZjzVzMm8b
</commit_message>
<xml_diff>
--- a/docs/Project_Handover.docx
+++ b/docs/Project_Handover.docx
@@ -123,7 +123,7 @@
           <w:iCs/>
           <w:i/>
         </w:rPr>
-        <w:t xml:space="preserve">Version 1.0 — October 2026. Prepared by Jamie Kim.</w:t>
+        <w:t xml:space="preserve">October 2026 Ver. Prepared by Jamie Kim.</w:t>
       </w:r>
     </w:p>
     <w:bookmarkStart w:id="20" w:name="about-this-document"/>
@@ -7992,13 +7992,13 @@
       </w:r>
     </w:p>
     <w:bookmarkEnd w:id="79"/>
-    <w:bookmarkStart w:id="80" w:name="a.7-next-experiments-if-revived"/>
+    <w:bookmarkStart w:id="80" w:name="X496d03c3a6f90c4c81867d5960baaeadec31c8e"/>
     <w:p>
       <w:pPr>
         <w:pStyle w:val="Heading2"/>
       </w:pPr>
       <w:r>
-        <w:t xml:space="preserve">A.7 Next experiments (if revived)</w:t>
+        <w:t xml:space="preserve">A.7 Next experiments (if further considered)</w:t>
       </w:r>
     </w:p>
     <w:p>
@@ -8434,7 +8434,7 @@
         <w:pStyle w:val="FirstParagraph"/>
       </w:pPr>
       <w:r>
-        <w:t xml:space="preserve">The boards already have Bluetooth radios. Using them would remove the</w:t>
+        <w:t xml:space="preserve">Arduino Nano 33 BLE Rev2s already have Bluetooth radios. Using them would remove the</w:t>
       </w:r>
       <w:r>
         <w:t xml:space="preserve"> </w:t>
@@ -8717,7 +8717,13 @@
         <w:t xml:space="preserve"> </w:t>
       </w:r>
       <w:r>
-        <w:t xml:space="preserve">50 Hz is possible but with less spare room than the wire;</w:t>
+        <w:t xml:space="preserve">50 Hz may be possible with a Bluetooth dongle but with less</w:t>
+      </w:r>
+      <w:r>
+        <w:t xml:space="preserve"> </w:t>
+      </w:r>
+      <w:r>
+        <w:t xml:space="preserve">spare room than the wire;</w:t>
       </w:r>
       <w:r>
         <w:t xml:space="preserve"> </w:t>

</xml_diff>